<commit_message>
docs: record the CSRF Referer control activated by the proxy fix
Flask-WTF applies strict Referer checking to CSRF-protected POSTs only when the
request is secure. Because TLS terminated at the edge, that check had never
been active in the deployed system - the same defect that suppressed HSTS was
also disabling a CSRF control. Applying ProxyFix turned both on.

Adds controls 31 and 32 to the security register, and updates the HSTS row,
which is now covered by a test rather than manual inspection.

Co-Authored-By: Claude Opus 5 <noreply@anthropic.com>
</commit_message>
<xml_diff>
--- a/reports/submission/deployment-verification.docx
+++ b/reports/submission/deployment-verification.docx
@@ -642,6 +642,59 @@
     <w:p>
       <w:r>
         <w:t>passed every test and every local check beforehand.</w:t>
+      </w:r>
+    </w:p>
+    <w:p>
+      <w:pPr>
+        <w:pStyle w:val="Heading3"/>
+      </w:pPr>
+      <w:r>
+        <w:t>A second, welcome consequence of the same fix</w:t>
+      </w:r>
+    </w:p>
+    <w:p>
+      <w:r>
+        <w:t>After the fix, the scripted post-deployment check began receiving 400 Bad</w:t>
+      </w:r>
+    </w:p>
+    <w:p>
+      <w:r>
+        <w:t>Request on sign-in. This was not a regression: Flask-WTF applies a strict</w:t>
+      </w:r>
+    </w:p>
+    <w:p>
+      <w:r>
+        <w:t>Referer check to CSRF-protected POSTs only when the request is secure.</w:t>
+      </w:r>
+    </w:p>
+    <w:p>
+      <w:r>
+        <w:t>Before ProxyFix, the application never considered any request secure, so that</w:t>
+      </w:r>
+    </w:p>
+    <w:p>
+      <w:r>
+        <w:t>check had never been active in production.</w:t>
+      </w:r>
+    </w:p>
+    <w:p>
+      <w:r>
+        <w:t>In other words, the same defect that suppressed HSTS was also silently</w:t>
+      </w:r>
+    </w:p>
+    <w:p>
+      <w:r>
+        <w:t>disabling a CSRF control. The scripted check was sending no Referer header;</w:t>
+      </w:r>
+    </w:p>
+    <w:p>
+      <w:r>
+        <w:t>a real browser always does. Adding the header made all checks pass (§5), and</w:t>
+      </w:r>
+    </w:p>
+    <w:p>
+      <w:r>
+        <w:t>the stricter behaviour is correct and has been kept.</w:t>
       </w:r>
     </w:p>
     <w:p>

</xml_diff>

<commit_message>
docs: record that the CD pipeline now runs end to end
CD was previously documented as written but never executed. It has now run
three times against the real application: it failed correctly when
FLY_API_TOKEN was absent, then deployed releases v3 and v4. Release v4 was
fully automatic - push to main, CI, quality gate, deploy, health check, with no
human step.

Co-Authored-By: Claude Opus 5 <noreply@anthropic.com>
</commit_message>
<xml_diff>
--- a/reports/submission/deployment-verification.docx
+++ b/reports/submission/deployment-verification.docx
@@ -1895,7 +1895,206 @@
         <w:pStyle w:val="Heading2"/>
       </w:pPr>
       <w:r>
-        <w:t>8. What is *not* claimed</w:t>
+        <w:t>8. Continuous Delivery verified</w:t>
+      </w:r>
+    </w:p>
+    <w:p>
+      <w:r>
+        <w:t>.github/workflows/cd.yml has now run end to end against this application.</w:t>
+      </w:r>
+    </w:p>
+    <w:tbl>
+      <w:tblPr>
+        <w:tblStyle w:val="LightGrid-Accent1"/>
+        <w:tblW w:type="auto" w:w="0"/>
+        <w:tblLook w:firstColumn="1" w:firstRow="1" w:lastColumn="0" w:lastRow="0" w:noHBand="0" w:noVBand="1" w:val="04A0"/>
+      </w:tblPr>
+      <w:tblGrid>
+        <w:gridCol w:w="2880"/>
+        <w:gridCol w:w="2880"/>
+        <w:gridCol w:w="2880"/>
+      </w:tblGrid>
+      <w:tr>
+        <w:tc>
+          <w:tcPr>
+            <w:tcW w:type="dxa" w:w="2880"/>
+          </w:tcPr>
+          <w:p>
+            <w:r>
+              <w:rPr>
+                <w:b/>
+              </w:rPr>
+              <w:t>Run</w:t>
+            </w:r>
+          </w:p>
+        </w:tc>
+        <w:tc>
+          <w:tcPr>
+            <w:tcW w:type="dxa" w:w="2880"/>
+          </w:tcPr>
+          <w:p>
+            <w:r>
+              <w:rPr>
+                <w:b/>
+              </w:rPr>
+              <w:t>Trigger</w:t>
+            </w:r>
+          </w:p>
+        </w:tc>
+        <w:tc>
+          <w:tcPr>
+            <w:tcW w:type="dxa" w:w="2880"/>
+          </w:tcPr>
+          <w:p>
+            <w:r>
+              <w:rPr>
+                <w:b/>
+              </w:rPr>
+              <w:t>Result</w:t>
+            </w:r>
+          </w:p>
+        </w:tc>
+      </w:tr>
+      <w:tr>
+        <w:tc>
+          <w:tcPr>
+            <w:tcW w:type="dxa" w:w="2880"/>
+          </w:tcPr>
+          <w:p>
+            <w:r>
+              <w:t>34086154403</w:t>
+            </w:r>
+          </w:p>
+        </w:tc>
+        <w:tc>
+          <w:tcPr>
+            <w:tcW w:type="dxa" w:w="2880"/>
+          </w:tcPr>
+          <w:p>
+            <w:r>
+              <w:t>workflow_run after CI</w:t>
+            </w:r>
+          </w:p>
+        </w:tc>
+        <w:tc>
+          <w:tcPr>
+            <w:tcW w:type="dxa" w:w="2880"/>
+          </w:tcPr>
+          <w:p>
+            <w:r>
+              <w:t>Failed - FLY_API_TOKEN not yet set. Correct behaviour: the deployment could not authenticate and the pipeline stopped.</w:t>
+            </w:r>
+          </w:p>
+        </w:tc>
+      </w:tr>
+      <w:tr>
+        <w:tc>
+          <w:tcPr>
+            <w:tcW w:type="dxa" w:w="2880"/>
+          </w:tcPr>
+          <w:p>
+            <w:r>
+              <w:t>34086342917</w:t>
+            </w:r>
+          </w:p>
+        </w:tc>
+        <w:tc>
+          <w:tcPr>
+            <w:tcW w:type="dxa" w:w="2880"/>
+          </w:tcPr>
+          <w:p>
+            <w:r>
+              <w:t>workflow_dispatch</w:t>
+            </w:r>
+          </w:p>
+        </w:tc>
+        <w:tc>
+          <w:tcPr>
+            <w:tcW w:type="dxa" w:w="2880"/>
+          </w:tcPr>
+          <w:p>
+            <w:r>
+              <w:t>Succeeded - released v3, health check passed on the first attempt, sign-in page smoke-tested.</w:t>
+            </w:r>
+          </w:p>
+        </w:tc>
+      </w:tr>
+      <w:tr>
+        <w:tc>
+          <w:tcPr>
+            <w:tcW w:type="dxa" w:w="2880"/>
+          </w:tcPr>
+          <w:p>
+            <w:r>
+              <w:t>34086822356</w:t>
+            </w:r>
+          </w:p>
+        </w:tc>
+        <w:tc>
+          <w:tcPr>
+            <w:tcW w:type="dxa" w:w="2880"/>
+          </w:tcPr>
+          <w:p>
+            <w:r>
+              <w:t>workflow_run after CI on main</w:t>
+            </w:r>
+          </w:p>
+        </w:tc>
+        <w:tc>
+          <w:tcPr>
+            <w:tcW w:type="dxa" w:w="2880"/>
+          </w:tcPr>
+          <w:p>
+            <w:r>
+              <w:t>Succeeded - released v4 fully automatically.</w:t>
+            </w:r>
+          </w:p>
+        </w:tc>
+      </w:tr>
+    </w:tbl>
+    <w:p/>
+    <w:p>
+      <w:r>
+        <w:t>The third run is the important one: a commit was pushed to main, CI ran its</w:t>
+      </w:r>
+    </w:p>
+    <w:p>
+      <w:r>
+        <w:t>six jobs, the quality gate passed, and CD deployed and health-checked the result</w:t>
+      </w:r>
+    </w:p>
+    <w:p>
+      <w:r>
+        <w:t>without any human step.</w:t>
+      </w:r>
+    </w:p>
+    <w:p>
+      <w:r>
+        <w:t>Deployment log evidence:</w:t>
+      </w:r>
+    </w:p>
+    <w:p>
+      <w:pPr>
+        <w:ind w:left="432"/>
+      </w:pPr>
+      <w:r>
+        <w:rPr>
+          <w:rFonts w:ascii="Consolas" w:hAnsi="Consolas"/>
+          <w:sz w:val="18"/>
+        </w:rPr>
+        <w:t>Deployment healthy after 1 attempt(s):</w:t>
+        <w:br/>
+        <w:t>{"checks":{"application":"ok","database":"ok"},"status":"healthy","version":"1.0.0"}</w:t>
+        <w:br/>
+        <w:t>Live sign-in page served correctly.</w:t>
+      </w:r>
+    </w:p>
+    <w:p>
+      <w:pPr>
+        <w:pStyle w:val="Heading2"/>
+      </w:pPr>
+      <w:r>
+        <w:t>9. What is *not* claimed</w:t>
       </w:r>
     </w:p>
     <w:p>
@@ -1952,34 +2151,6 @@
     <w:p>
       <w:r>
         <w:t>docs/flyio-deployment.md §5 and §11.</w:t>
-      </w:r>
-    </w:p>
-    <w:p>
-      <w:pPr>
-        <w:pStyle w:val="ListBullet"/>
-      </w:pPr>
-      <w:r>
-        <w:t>The CD pipeline has not yet run against this app. .github/workflows/cd.yml</w:t>
-      </w:r>
-    </w:p>
-    <w:p>
-      <w:r>
-        <w:t>is written and gated on CI success, but it needs FLY_API_TOKEN in the</w:t>
-      </w:r>
-    </w:p>
-    <w:p>
-      <w:r>
-        <w:t>repository's Actions secrets and a push to main. Both deployments so far were</w:t>
-      </w:r>
-    </w:p>
-    <w:p>
-      <w:r>
-        <w:t>performed manually with flyctl deploy. Setting up the token is step 12 of</w:t>
-      </w:r>
-    </w:p>
-    <w:p>
-      <w:r>
-        <w:t>docs/flyio-deployment.md.</w:t>
       </w:r>
     </w:p>
     <w:p>

</xml_diff>